<commit_message>
docs: remove AKC-03 export comment leak
</commit_message>
<xml_diff>
--- a/doc/customer-docs/working/exports/AKC-03-KEY-HANDOVER-RETURN-RECEIPT-WORKING-DRAFT-PL-v0.2.docx
+++ b/doc/customer-docs/working/exports/AKC-03-KEY-HANDOVER-RETURN-RECEIPT-WORKING-DRAFT-PL-v0.2.docx
@@ -504,22 +504,6 @@
       <w:pPr>
         <w:spacing w:after="40"/>
       </w:pPr>
-    </w:p>
-    <w:p>
-      <w:pPr>
-        <w:keepNext w:val="0"/>
-        <w:spacing w:before="0" w:after="120" w:line="300" w:lineRule="auto"/>
-      </w:pPr>
-      <w:r>
-        <w:rPr>
-          <w:rFonts w:ascii="Calibri" w:hAnsi="Calibri" w:eastAsia="Calibri"/>
-          <w:b w:val="0"/>
-          <w:i w:val="0"/>
-          <w:color w:val="182330"/>
-          <w:sz w:val="21"/>
-        </w:rPr>
-        <w:t>&lt;!-- v0.2 = warmth/clarity micro-patch after SCO-01: owner reassurance, who-fills line, prominent no-secrets rule, digital-access skip note, mixed key-test exception note, handover/return block instruction. Structure and custody doctrine unchanged. --&gt;</w:t>
-      </w:r>
     </w:p>
     <w:p>
       <w:pPr>

</xml_diff>